<commit_message>
docs(dns): captura de la nic.md si raportul de scoatere a brandurilor
Fisierele stateau necomise pe laptop, deci proiectul de pe GitHub nu era
complet. Captura era in radacina, cu numele UUID pe care i-l daduse telefonul;
a intrat in `docs/` langa notele de DNS, fiindca exact ele o explica — arata
campurile de nameservere de la nic.md, completate cu `ns1/ns2.vercel-dns.com`.

Raportul JSON de scoatere a brandurilor e cel exceptat explicit in `.gitignore`:
e singurul drum inapoi pentru randuri care nu mai exista in baza.

Co-Authored-By: Claude Opus 5 <noreply@anthropic.com>
Claude-Session: https://claude.ai/code/session_01KpQkCnCVz7dioKGHsSnJvq
</commit_message>
<xml_diff>
--- a/docs/DNS-anvelope-ungheni-scurt.docx
+++ b/docs/DNS-anvelope-ungheni-scurt.docx
@@ -47,7 +47,7 @@
         <w:pStyle w:val="FirstParagraph"/>
       </w:pPr>
       <w:r>
-        <w:t xml:space="preserve">Domeniul e deja atașat proiectului Vercel.</w:t>
+        <w:t xml:space="preserve">Domeniul e atașat proiectului Vercel.</w:t>
       </w:r>
       <w:r>
         <w:t xml:space="preserve"> </w:t>
@@ -62,95 +62,94 @@
         <w:t xml:space="preserve"> </w:t>
       </w:r>
       <w:r>
-        <w:t xml:space="preserve">are redirect 308 spre apex,</w:t>
-      </w:r>
-      <w:r>
-        <w:t xml:space="preserve"> </w:t>
-      </w:r>
-      <w:r>
-        <w:t xml:space="preserve">configurat de partea noastră. De pus în zona de la iHost:</w:t>
+        <w:t xml:space="preserve">are redirect 308 spre apex.</w:t>
+      </w:r>
+      <w:r>
+        <w:t xml:space="preserve"> </w:t>
+      </w:r>
+      <w:r>
+        <w:t xml:space="preserve">Două variante, după accesul pe care îl ai.</w:t>
+      </w:r>
+    </w:p>
+    <w:bookmarkStart w:id="20" w:name="a.-ai-acces-în-panoul-ihost-recomandat"/>
+    <w:p>
+      <w:pPr>
+        <w:pStyle w:val="Heading1"/>
+      </w:pPr>
+      <w:r>
+        <w:t xml:space="preserve">A. Ai acces în panoul iHost (recomandat)</w:t>
       </w:r>
     </w:p>
     <w:p>
       <w:pPr>
-        <w:pStyle w:val="SourceCode"/>
-      </w:pPr>
-      <w:r>
-        <w:rPr>
-          <w:rStyle w:val="VerbatimChar"/>
-        </w:rPr>
-        <w:t xml:space="preserve">@      A       216.198.79.1</w:t>
-      </w:r>
-      <w:r>
-        <w:br/>
-      </w:r>
-      <w:r>
-        <w:rPr>
-          <w:rStyle w:val="VerbatimChar"/>
-        </w:rPr>
-        <w:t xml:space="preserve">@      A       64.29.17.1</w:t>
-      </w:r>
-      <w:r>
-        <w:br/>
-      </w:r>
-      <w:r>
-        <w:rPr>
-          <w:rStyle w:val="VerbatimChar"/>
-        </w:rPr>
-        <w:t xml:space="preserve">www    CNAME   c49ba0ea1b17b3d1.vercel-dns-017.com.</w:t>
+        <w:pStyle w:val="FirstParagraph"/>
+      </w:pPr>
+      <w:r>
+        <w:t xml:space="preserve">Nameserverele rămân la iHost, se schimbă doar două înregistrări:</w:t>
       </w:r>
     </w:p>
     <w:p>
       <w:pPr>
-        <w:pStyle w:val="FirstParagraph"/>
-      </w:pPr>
-      <w:r>
-        <w:t xml:space="preserve">Se șterg</w:t>
-      </w:r>
-      <w:r>
-        <w:t xml:space="preserve"> </w:t>
-      </w:r>
-      <w:r>
-        <w:rPr>
-          <w:rStyle w:val="VerbatimChar"/>
-        </w:rPr>
-        <w:t xml:space="preserve">A @ → 31.131.1.41</w:t>
-      </w:r>
-      <w:r>
-        <w:t xml:space="preserve"> </w:t>
-      </w:r>
-      <w:r>
-        <w:t xml:space="preserve">și</w:t>
-      </w:r>
-      <w:r>
-        <w:t xml:space="preserve"> </w:t>
-      </w:r>
-      <w:r>
-        <w:rPr>
-          <w:rStyle w:val="VerbatimChar"/>
-        </w:rPr>
-        <w:t xml:space="preserve">A www → 31.131.1.41</w:t>
-      </w:r>
-      <w:r>
-        <w:t xml:space="preserve">. TTL 300.</w:t>
+        <w:pStyle w:val="SourceCode"/>
+      </w:pPr>
+      <w:r>
+        <w:rPr>
+          <w:rStyle w:val="VerbatimChar"/>
+        </w:rPr>
+        <w:t xml:space="preserve">@      A       216.198.79.1</w:t>
+      </w:r>
+      <w:r>
+        <w:br/>
+      </w:r>
+      <w:r>
+        <w:rPr>
+          <w:rStyle w:val="VerbatimChar"/>
+        </w:rPr>
+        <w:t xml:space="preserve">@      A       64.29.17.1</w:t>
+      </w:r>
+      <w:r>
+        <w:br/>
+      </w:r>
+      <w:r>
+        <w:rPr>
+          <w:rStyle w:val="VerbatimChar"/>
+        </w:rPr>
+        <w:t xml:space="preserve">www    CNAME   c49ba0ea1b17b3d1.vercel-dns-017.com.</w:t>
       </w:r>
     </w:p>
     <w:p>
       <w:pPr>
-        <w:pStyle w:val="BodyText"/>
-      </w:pPr>
-      <w:r>
-        <w:rPr>
-          <w:bCs/>
-          <w:b/>
-        </w:rPr>
-        <w:t xml:space="preserve">Nameserverele rămân la iHost.</w:t>
-      </w:r>
-      <w:r>
-        <w:t xml:space="preserve"> </w:t>
-      </w:r>
-      <w:r>
-        <w:t xml:space="preserve">Pe domeniu e și poșta:</w:t>
+        <w:pStyle w:val="FirstParagraph"/>
+      </w:pPr>
+      <w:r>
+        <w:t xml:space="preserve">Se șterg</w:t>
+      </w:r>
+      <w:r>
+        <w:t xml:space="preserve"> </w:t>
+      </w:r>
+      <w:r>
+        <w:rPr>
+          <w:rStyle w:val="VerbatimChar"/>
+        </w:rPr>
+        <w:t xml:space="preserve">A @ → 31.131.1.41</w:t>
+      </w:r>
+      <w:r>
+        <w:t xml:space="preserve"> </w:t>
+      </w:r>
+      <w:r>
+        <w:t xml:space="preserve">și</w:t>
+      </w:r>
+      <w:r>
+        <w:t xml:space="preserve"> </w:t>
+      </w:r>
+      <w:r>
+        <w:rPr>
+          <w:rStyle w:val="VerbatimChar"/>
+        </w:rPr>
+        <w:t xml:space="preserve">A www → 31.131.1.41</w:t>
+      </w:r>
+      <w:r>
+        <w:t xml:space="preserve">. Restul zonei —</w:t>
       </w:r>
       <w:r>
         <w:t xml:space="preserve"> </w:t>
@@ -195,6 +194,30 @@
         <w:rPr>
           <w:rStyle w:val="VerbatimChar"/>
         </w:rPr>
+        <w:t xml:space="preserve">smtp</w:t>
+      </w:r>
+      <w:r>
+        <w:t xml:space="preserve">,</w:t>
+      </w:r>
+      <w:r>
+        <w:t xml:space="preserve"> </w:t>
+      </w:r>
+      <w:r>
+        <w:rPr>
+          <w:rStyle w:val="VerbatimChar"/>
+        </w:rPr>
+        <w:t xml:space="preserve">pop</w:t>
+      </w:r>
+      <w:r>
+        <w:t xml:space="preserve">,</w:t>
+      </w:r>
+      <w:r>
+        <w:t xml:space="preserve"> </w:t>
+      </w:r>
+      <w:r>
+        <w:rPr>
+          <w:rStyle w:val="VerbatimChar"/>
+        </w:rPr>
         <w:t xml:space="preserve">SPF</w:t>
       </w:r>
       <w:r>
@@ -213,15 +236,25 @@
         <w:t xml:space="preserve"> </w:t>
       </w:r>
       <w:r>
-        <w:t xml:space="preserve">— se lasă neatinse.</w:t>
+        <w:t xml:space="preserve">— rămâne neatins.</w:t>
+      </w:r>
+    </w:p>
+    <w:bookmarkEnd w:id="20"/>
+    <w:bookmarkStart w:id="21" w:name="b.-ai-doar-nic.md"/>
+    <w:p>
+      <w:pPr>
+        <w:pStyle w:val="Heading1"/>
+      </w:pPr>
+      <w:r>
+        <w:t xml:space="preserve">B. Ai doar nic.md</w:t>
       </w:r>
     </w:p>
     <w:p>
       <w:pPr>
-        <w:pStyle w:val="BodyText"/>
-      </w:pPr>
-      <w:r>
-        <w:t xml:space="preserve">Certificatul se emite singur. Verificare:</w:t>
+        <w:pStyle w:val="FirstParagraph"/>
+      </w:pPr>
+      <w:r>
+        <w:t xml:space="preserve">Se schimbă nameserverele, primele două câmpuri, celelalte două goale:</w:t>
       </w:r>
     </w:p>
     <w:p>
@@ -232,7 +265,7 @@
         <w:rPr>
           <w:rStyle w:val="VerbatimChar"/>
         </w:rPr>
-        <w:t xml:space="preserve">dig +short anvelope-ungheni.md A          # 216.198.79.1, 64.29.17.1</w:t>
+        <w:t xml:space="preserve">ns1.vercel-dns.com</w:t>
       </w:r>
       <w:r>
         <w:br/>
@@ -241,7 +274,7 @@
         <w:rPr>
           <w:rStyle w:val="VerbatimChar"/>
         </w:rPr>
-        <w:t xml:space="preserve">dig +short www.anvelope-ungheni.md CNAME  # c49ba0ea1b17b3d1.vercel-dns-017.com.</w:t>
+        <w:t xml:space="preserve">ns2.vercel-dns.com</w:t>
       </w:r>
     </w:p>
     <w:p>
@@ -249,7 +282,417 @@
         <w:pStyle w:val="FirstParagraph"/>
       </w:pPr>
       <w:r>
-        <w:t xml:space="preserve">Revenire:</w:t>
+        <w:t xml:space="preserve">Zona a fost deja recreată integral la Vercel, inclusiv poșta, deci nu se pierde</w:t>
+      </w:r>
+      <w:r>
+        <w:t xml:space="preserve"> </w:t>
+      </w:r>
+      <w:r>
+        <w:t xml:space="preserve">nimic la comutare:</w:t>
+      </w:r>
+    </w:p>
+    <w:tbl>
+      <w:tblPr>
+        <w:tblStyle w:val="Table"/>
+        <w:tblW w:type="auto" w:w="0"/>
+        <w:tblLook w:firstRow="1" w:lastRow="0" w:firstColumn="0" w:lastColumn="0" w:noHBand="0" w:noVBand="0" w:val="0020"/>
+        <w:jc w:val="start"/>
+      </w:tblPr>
+      <w:tblGrid>
+        <w:gridCol w:w="2640"/>
+        <w:gridCol w:w="2640"/>
+        <w:gridCol w:w="2640"/>
+      </w:tblGrid>
+      <w:tr>
+        <w:trPr>
+          <w:tblHeader w:val="true"/>
+        </w:trPr>
+        <w:tc>
+          <w:tcPr/>
+          <w:p>
+            <w:pPr>
+              <w:pStyle w:val="Compact"/>
+              <w:jc w:val="left"/>
+            </w:pPr>
+            <w:r>
+              <w:t xml:space="preserve">Nume</w:t>
+            </w:r>
+          </w:p>
+        </w:tc>
+        <w:tc>
+          <w:tcPr/>
+          <w:p>
+            <w:pPr>
+              <w:pStyle w:val="Compact"/>
+              <w:jc w:val="left"/>
+            </w:pPr>
+            <w:r>
+              <w:t xml:space="preserve">Tip</w:t>
+            </w:r>
+          </w:p>
+        </w:tc>
+        <w:tc>
+          <w:tcPr/>
+          <w:p>
+            <w:pPr>
+              <w:pStyle w:val="Compact"/>
+              <w:jc w:val="left"/>
+            </w:pPr>
+            <w:r>
+              <w:t xml:space="preserve">Valoare</w:t>
+            </w:r>
+          </w:p>
+        </w:tc>
+      </w:tr>
+      <w:tr>
+        <w:tc>
+          <w:tcPr/>
+          <w:p>
+            <w:pPr>
+              <w:pStyle w:val="Compact"/>
+              <w:jc w:val="left"/>
+            </w:pPr>
+            <w:r>
+              <w:rPr>
+                <w:rStyle w:val="VerbatimChar"/>
+              </w:rPr>
+              <w:t xml:space="preserve">@</w:t>
+            </w:r>
+          </w:p>
+        </w:tc>
+        <w:tc>
+          <w:tcPr/>
+          <w:p>
+            <w:pPr>
+              <w:pStyle w:val="Compact"/>
+              <w:jc w:val="left"/>
+            </w:pPr>
+            <w:r>
+              <w:t xml:space="preserve">MX</w:t>
+            </w:r>
+          </w:p>
+        </w:tc>
+        <w:tc>
+          <w:tcPr/>
+          <w:p>
+            <w:pPr>
+              <w:pStyle w:val="Compact"/>
+              <w:jc w:val="left"/>
+            </w:pPr>
+            <w:r>
+              <w:rPr>
+                <w:rStyle w:val="VerbatimChar"/>
+              </w:rPr>
+              <w:t xml:space="preserve">10 mail.anvelope-ungheni.md.</w:t>
+            </w:r>
+          </w:p>
+        </w:tc>
+      </w:tr>
+      <w:tr>
+        <w:tc>
+          <w:tcPr/>
+          <w:p>
+            <w:pPr>
+              <w:pStyle w:val="Compact"/>
+              <w:jc w:val="left"/>
+            </w:pPr>
+            <w:r>
+              <w:rPr>
+                <w:rStyle w:val="VerbatimChar"/>
+              </w:rPr>
+              <w:t xml:space="preserve">mail</w:t>
+            </w:r>
+            <w:r>
+              <w:t xml:space="preserve">,</w:t>
+            </w:r>
+            <w:r>
+              <w:t xml:space="preserve"> </w:t>
+            </w:r>
+            <w:r>
+              <w:rPr>
+                <w:rStyle w:val="VerbatimChar"/>
+              </w:rPr>
+              <w:t xml:space="preserve">ftp</w:t>
+            </w:r>
+            <w:r>
+              <w:t xml:space="preserve">,</w:t>
+            </w:r>
+            <w:r>
+              <w:t xml:space="preserve"> </w:t>
+            </w:r>
+            <w:r>
+              <w:rPr>
+                <w:rStyle w:val="VerbatimChar"/>
+              </w:rPr>
+              <w:t xml:space="preserve">smtp</w:t>
+            </w:r>
+            <w:r>
+              <w:t xml:space="preserve">,</w:t>
+            </w:r>
+            <w:r>
+              <w:t xml:space="preserve"> </w:t>
+            </w:r>
+            <w:r>
+              <w:rPr>
+                <w:rStyle w:val="VerbatimChar"/>
+              </w:rPr>
+              <w:t xml:space="preserve">pop</w:t>
+            </w:r>
+          </w:p>
+        </w:tc>
+        <w:tc>
+          <w:tcPr/>
+          <w:p>
+            <w:pPr>
+              <w:pStyle w:val="Compact"/>
+              <w:jc w:val="left"/>
+            </w:pPr>
+            <w:r>
+              <w:t xml:space="preserve">A</w:t>
+            </w:r>
+          </w:p>
+        </w:tc>
+        <w:tc>
+          <w:tcPr/>
+          <w:p>
+            <w:pPr>
+              <w:pStyle w:val="Compact"/>
+              <w:jc w:val="left"/>
+            </w:pPr>
+            <w:r>
+              <w:rPr>
+                <w:rStyle w:val="VerbatimChar"/>
+              </w:rPr>
+              <w:t xml:space="preserve">31.131.1.41</w:t>
+            </w:r>
+          </w:p>
+        </w:tc>
+      </w:tr>
+      <w:tr>
+        <w:tc>
+          <w:tcPr/>
+          <w:p>
+            <w:pPr>
+              <w:pStyle w:val="Compact"/>
+              <w:jc w:val="left"/>
+            </w:pPr>
+            <w:r>
+              <w:rPr>
+                <w:rStyle w:val="VerbatimChar"/>
+              </w:rPr>
+              <w:t xml:space="preserve">@</w:t>
+            </w:r>
+          </w:p>
+        </w:tc>
+        <w:tc>
+          <w:tcPr/>
+          <w:p>
+            <w:pPr>
+              <w:pStyle w:val="Compact"/>
+              <w:jc w:val="left"/>
+            </w:pPr>
+            <w:r>
+              <w:t xml:space="preserve">TXT</w:t>
+            </w:r>
+          </w:p>
+        </w:tc>
+        <w:tc>
+          <w:tcPr/>
+          <w:p>
+            <w:pPr>
+              <w:pStyle w:val="Compact"/>
+              <w:jc w:val="left"/>
+            </w:pPr>
+            <w:r>
+              <w:rPr>
+                <w:rStyle w:val="VerbatimChar"/>
+              </w:rPr>
+              <w:t xml:space="preserve">v=spf1 mx ip4:31.131.1.250 ~all</w:t>
+            </w:r>
+          </w:p>
+        </w:tc>
+      </w:tr>
+      <w:tr>
+        <w:tc>
+          <w:tcPr/>
+          <w:p>
+            <w:pPr>
+              <w:pStyle w:val="Compact"/>
+              <w:jc w:val="left"/>
+            </w:pPr>
+            <w:r>
+              <w:rPr>
+                <w:rStyle w:val="VerbatimChar"/>
+              </w:rPr>
+              <w:t xml:space="preserve">_dmarc</w:t>
+            </w:r>
+          </w:p>
+        </w:tc>
+        <w:tc>
+          <w:tcPr/>
+          <w:p>
+            <w:pPr>
+              <w:pStyle w:val="Compact"/>
+              <w:jc w:val="left"/>
+            </w:pPr>
+            <w:r>
+              <w:t xml:space="preserve">TXT</w:t>
+            </w:r>
+          </w:p>
+        </w:tc>
+        <w:tc>
+          <w:tcPr/>
+          <w:p>
+            <w:pPr>
+              <w:pStyle w:val="Compact"/>
+              <w:jc w:val="left"/>
+            </w:pPr>
+            <w:r>
+              <w:rPr>
+                <w:rStyle w:val="VerbatimChar"/>
+              </w:rPr>
+              <w:t xml:space="preserve">v=DMARC1; p=none; sp=none</w:t>
+            </w:r>
+          </w:p>
+        </w:tc>
+      </w:tr>
+    </w:tbl>
+    <w:p>
+      <w:pPr>
+        <w:pStyle w:val="BodyText"/>
+      </w:pPr>
+      <w:r>
+        <w:t xml:space="preserve">Apex-ul și</w:t>
+      </w:r>
+      <w:r>
+        <w:t xml:space="preserve"> </w:t>
+      </w:r>
+      <w:r>
+        <w:rPr>
+          <w:rStyle w:val="VerbatimChar"/>
+        </w:rPr>
+        <w:t xml:space="preserve">www</w:t>
+      </w:r>
+      <w:r>
+        <w:t xml:space="preserve"> </w:t>
+      </w:r>
+      <w:r>
+        <w:t xml:space="preserve">le servește Vercel automat.</w:t>
+      </w:r>
+    </w:p>
+    <w:p>
+      <w:pPr>
+        <w:pStyle w:val="BodyText"/>
+      </w:pPr>
+      <w:r>
+        <w:t xml:space="preserve">Două valori au fost curățate față de zona veche: SPF-ul a pierdut mecanismul</w:t>
+      </w:r>
+      <w:r>
+        <w:t xml:space="preserve"> </w:t>
+      </w:r>
+      <w:r>
+        <w:rPr>
+          <w:rStyle w:val="VerbatimChar"/>
+        </w:rPr>
+        <w:t xml:space="preserve">a</w:t>
+      </w:r>
+      <w:r>
+        <w:t xml:space="preserve">,</w:t>
+      </w:r>
+      <w:r>
+        <w:t xml:space="preserve"> </w:t>
+      </w:r>
+      <w:r>
+        <w:t xml:space="preserve">care după comutare ar fi autorizat rețeaua site-ului să trimită poștă (</w:t>
+      </w:r>
+      <w:r>
+        <w:rPr>
+          <w:rStyle w:val="VerbatimChar"/>
+        </w:rPr>
+        <w:t xml:space="preserve">mx</w:t>
+      </w:r>
+      <w:r>
+        <w:t xml:space="preserve"> </w:t>
+      </w:r>
+      <w:r>
+        <w:t xml:space="preserve">acoperă același server, deci livrarea nu se schimbă), iar DMARC-ul a pierdut</w:t>
+      </w:r>
+      <w:r>
+        <w:t xml:space="preserve"> </w:t>
+      </w:r>
+      <w:r>
+        <w:rPr>
+          <w:rStyle w:val="VerbatimChar"/>
+        </w:rPr>
+        <w:t xml:space="preserve">rua=mailto:|USER|@...</w:t>
+      </w:r>
+      <w:r>
+        <w:t xml:space="preserve">, un șablon lăsat neînlocuit, care oricum nu trimitea</w:t>
+      </w:r>
+      <w:r>
+        <w:t xml:space="preserve"> </w:t>
+      </w:r>
+      <w:r>
+        <w:t xml:space="preserve">rapoarte nicăieri.</w:t>
+      </w:r>
+    </w:p>
+    <w:bookmarkEnd w:id="21"/>
+    <w:bookmarkStart w:id="22" w:name="verificare-după-oricare-variantă"/>
+    <w:p>
+      <w:pPr>
+        <w:pStyle w:val="Heading1"/>
+      </w:pPr>
+      <w:r>
+        <w:t xml:space="preserve">Verificare, după oricare variantă</w:t>
+      </w:r>
+    </w:p>
+    <w:p>
+      <w:pPr>
+        <w:pStyle w:val="SourceCode"/>
+      </w:pPr>
+      <w:r>
+        <w:rPr>
+          <w:rStyle w:val="VerbatimChar"/>
+        </w:rPr>
+        <w:t xml:space="preserve">dig +short anvelope-ungheni.md A          # 216.198.79.1, 64.29.17.1</w:t>
+      </w:r>
+      <w:r>
+        <w:br/>
+      </w:r>
+      <w:r>
+        <w:rPr>
+          <w:rStyle w:val="VerbatimChar"/>
+        </w:rPr>
+        <w:t xml:space="preserve">dig +short mail.anvelope-ungheni.md A     # 31.131.1.41  ← poșta, obligatoriu</w:t>
+      </w:r>
+      <w:r>
+        <w:br/>
+      </w:r>
+      <w:r>
+        <w:rPr>
+          <w:rStyle w:val="VerbatimChar"/>
+        </w:rPr>
+        <w:t xml:space="preserve">dig +short anvelope-ungheni.md MX         # 10 mail.anvelope-ungheni.md.</w:t>
+      </w:r>
+    </w:p>
+    <w:p>
+      <w:pPr>
+        <w:pStyle w:val="FirstParagraph"/>
+      </w:pPr>
+      <w:r>
+        <w:t xml:space="preserve">Certificatul HTTPS se emite singur. Revenire: nameserverele înapoi pe</w:t>
+      </w:r>
+      <w:r>
+        <w:t xml:space="preserve"> </w:t>
+      </w:r>
+      <w:r>
+        <w:rPr>
+          <w:rStyle w:val="VerbatimChar"/>
+        </w:rPr>
+        <w:t xml:space="preserve">a–d.ihostdns.net</w:t>
+      </w:r>
+      <w:r>
+        <w:t xml:space="preserve">, sau</w:t>
       </w:r>
       <w:r>
         <w:t xml:space="preserve"> </w:t>
@@ -294,6 +737,7 @@
         <w:t xml:space="preserve">.</w:t>
       </w:r>
     </w:p>
+    <w:bookmarkEnd w:id="22"/>
     <w:sectPr/>
   </w:body>
 </w:document>

</xml_diff>